<commit_message>
About me text update
</commit_message>
<xml_diff>
--- a/assets/pdf/ats-cv_yeison-bedoya-lopez_product-design.docx
+++ b/assets/pdf/ats-cv_yeison-bedoya-lopez_product-design.docx
@@ -160,19 +160,15 @@
           <w:szCs w:val="24"/>
         </w:rPr>
       </w:pPr>
-      <w:hyperlink r:id="rId8">
-        <w:r>
-          <w:rPr>
-            <w:rFonts w:ascii="Rubik" w:cs="Rubik" w:eastAsia="Rubik" w:hAnsi="Rubik"/>
-            <w:color w:val="1155cc"/>
-            <w:sz w:val="24"/>
-            <w:szCs w:val="24"/>
-            <w:u w:val="single"/>
-            <w:rtl w:val="0"/>
-          </w:rPr>
-          <w:t xml:space="preserve">yeilopez.design@gmail.com</w:t>
-        </w:r>
-      </w:hyperlink>
+      <w:r>
+        <w:rPr>
+          <w:rFonts w:ascii="Rubik" w:cs="Rubik" w:eastAsia="Rubik" w:hAnsi="Rubik"/>
+          <w:sz w:val="24"/>
+          <w:szCs w:val="24"/>
+          <w:rtl w:val="0"/>
+        </w:rPr>
+        <w:t xml:space="preserve">yeilopez.design@gmail.com</w:t>
+      </w:r>
       <w:r>
         <w:rPr>
           <w:rtl w:val="0"/>
@@ -242,28 +238,28 @@
           <w:rFonts w:ascii="Inter" w:cs="Inter" w:eastAsia="Inter" w:hAnsi="Inter"/>
           <w:rtl w:val="0"/>
         </w:rPr>
-        <w:t xml:space="preserve">Combino product thinking, estrategia UX y design systems para crear </w:t>
+        <w:t xml:space="preserve">Senior Product Designer con más de 8 años en el oficio. Tengo una base sólida en diseño gráfico que garantiza la calidad visual, y la </w:t>
       </w:r>
       <w:r>
         <w:rPr>
           <w:rFonts w:ascii="Inter SemiBold" w:cs="Inter SemiBold" w:eastAsia="Inter SemiBold" w:hAnsi="Inter SemiBold"/>
           <w:rtl w:val="0"/>
         </w:rPr>
-        <w:t xml:space="preserve">interfaces escalables con impacto operativo</w:t>
-      </w:r>
-      <w:r>
-        <w:rPr>
-          <w:rFonts w:ascii="Inter" w:cs="Inter" w:eastAsia="Inter" w:hAnsi="Inter"/>
-          <w:rtl w:val="0"/>
-        </w:rPr>
-        <w:t xml:space="preserve">. Trabajo en ciclos cortos con ingeniería y negocio, </w:t>
+        <w:t xml:space="preserve">combino con entendimiento de negocio y tecnología para llevar cada proyecto a su máximo potencial</w:t>
+      </w:r>
+      <w:r>
+        <w:rPr>
+          <w:rFonts w:ascii="Inter" w:cs="Inter" w:eastAsia="Inter" w:hAnsi="Inter"/>
+          <w:rtl w:val="0"/>
+        </w:rPr>
+        <w:t xml:space="preserve">. Itero en ciclos cortos </w:t>
       </w:r>
       <w:r>
         <w:rPr>
           <w:rFonts w:ascii="Inter SemiBold" w:cs="Inter SemiBold" w:eastAsia="Inter SemiBold" w:hAnsi="Inter SemiBold"/>
           <w:rtl w:val="0"/>
         </w:rPr>
-        <w:t xml:space="preserve">validando cada decisión con datos y feedback real de usuarios</w:t>
+        <w:t xml:space="preserve">validando cada decisión según lo que dicen los datos y el feedback del usuario</w:t>
       </w:r>
       <w:r>
         <w:rPr>

</xml_diff>